<commit_message>
Kit: segundo sócio assinante opcional (qualificação e assinatura no contrato e na carta; sugestão automática com dois admins)
</commit_message>
<xml_diff>
--- a/assets/modelos/carta-responsabilidade.docx
+++ b/assets/modelos/carta-responsabilidade.docx
@@ -356,7 +356,7 @@
     </w:p>
     <w:p>
       <w:pPr>
-        <w:spacing w:after="120"/>
+        <w:spacing w:after="300"/>
         <w:jc w:val="center"/>
       </w:pPr>
       <w:r>
@@ -368,6 +368,54 @@
           <w:szCs w:val="21"/>
         </w:rPr>
         <w:t xml:space="preserve">{{RAZAO_SOCIAL}}</w:t>
+      </w:r>
+    </w:p>
+    <w:p>
+      <w:pPr>
+        <w:spacing w:after="40"/>
+        <w:jc w:val="center"/>
+      </w:pPr>
+      <w:r>
+        <w:rPr>
+          <w:rFonts w:ascii="Arial" w:cs="Arial" w:eastAsia="Arial" w:hAnsi="Arial"/>
+          <w:b w:val="false"/>
+          <w:bCs w:val="false"/>
+          <w:sz w:val="21"/>
+          <w:szCs w:val="21"/>
+        </w:rPr>
+        <w:t xml:space="preserve">{{ASS2_LINHA}}</w:t>
+      </w:r>
+    </w:p>
+    <w:p>
+      <w:pPr>
+        <w:spacing w:after="20"/>
+        <w:jc w:val="center"/>
+      </w:pPr>
+      <w:r>
+        <w:rPr>
+          <w:rFonts w:ascii="Arial" w:cs="Arial" w:eastAsia="Arial" w:hAnsi="Arial"/>
+          <w:b/>
+          <w:bCs/>
+          <w:sz w:val="21"/>
+          <w:szCs w:val="21"/>
+        </w:rPr>
+        <w:t xml:space="preserve">{{ASS2_NOME}}</w:t>
+      </w:r>
+    </w:p>
+    <w:p>
+      <w:pPr>
+        <w:spacing w:after="120"/>
+        <w:jc w:val="center"/>
+      </w:pPr>
+      <w:r>
+        <w:rPr>
+          <w:rFonts w:ascii="Arial" w:cs="Arial" w:eastAsia="Arial" w:hAnsi="Arial"/>
+          <w:b w:val="false"/>
+          <w:bCs w:val="false"/>
+          <w:sz w:val="21"/>
+          <w:szCs w:val="21"/>
+        </w:rPr>
+        <w:t xml:space="preserve">{{ASS2_SUB}}</w:t>
       </w:r>
     </w:p>
     <w:p>

</xml_diff>